<commit_message>
Rename Aurora to Jotspring in legal docs, terms page and edge functions
</commit_message>
<xml_diff>
--- a/legal/Aurora-Privacy-Policy.docx
+++ b/legal/Aurora-Privacy-Policy.docx
@@ -12,7 +12,7 @@
           <w:color w:val="7A2A26"/>
           <w:sz w:val="40"/>
         </w:rPr>
-        <w:t>AURORA</w:t>
+        <w:t>JOTSPRING</w:t>
       </w:r>
     </w:p>
     <w:p>
@@ -35,7 +35,7 @@
     </w:p>
     <w:p>
       <w:r>
-        <w:t>This policy explains what information Aurora collects, how it is used and shared, how long it is kept, and the choices and rights you have.</w:t>
+        <w:t>This policy explains what information Jotspring collects, how it is used and shared, how long it is kept, and the choices and rights you have.</w:t>
       </w:r>
     </w:p>
     <w:p>
@@ -65,7 +65,7 @@
     </w:p>
     <w:p>
       <w:r>
-        <w:t>Aurora is operated by Jai Akash, an individual sole proprietor trading as "Nvexis" ("we", "us", "our"), who is the data controller / data fiduciary for personal information processed through the Service. Contact: nvexis14@gmail.com.</w:t>
+        <w:t>Jotspring is operated by Jai Akash, an individual sole proprietor trading as "Nvexis" ("we", "us", "our"), who is the data controller / data fiduciary for personal information processed through the Service. Contact: nvexis14@gmail.com.</w:t>
       </w:r>
     </w:p>
     <w:p>
@@ -79,7 +79,7 @@
     </w:p>
     <w:p>
       <w:r>
-        <w:t>This policy covers personal information we process when you visit our marketing site, create an account, and use the Aurora application. It does not cover third-party services that have their own policies (see §5).</w:t>
+        <w:t>This policy covers personal information we process when you visit our marketing site, create an account, and use the Jotspring application. It does not cover third-party services that have their own policies (see §5).</w:t>
       </w:r>
     </w:p>
     <w:p>

</xml_diff>